<commit_message>
Point D: clarification fenêtrage Hann (amont IRCAM) + params table corrigée
</commit_message>
<xml_diff>
--- a/Versions-html-and-docx/section_intro_v5.docx
+++ b/Versions-html-and-docx/section_intro_v5.docx
@@ -891,7 +891,7 @@
                 <w:b/>
                 <w:sz w:val="18"/>
               </w:rPr>
-              <w:t>Algorithme</w:t>
+              <w:t>Données d'entrée</w:t>
             </w:r>
           </w:p>
         </w:tc>
@@ -909,7 +909,7 @@
                 <w:b w:val="0"/>
                 <w:sz w:val="18"/>
               </w:rPr>
-              <w:t>scipy.signal.find_peaks — pic le plus proéminent (pas premier pic)</w:t>
+              <w:t>Enveloppes spectrales pré-calculées (specenv, 1 024 bins) — fenêtrage Hann + lissage appliqués en amont par le pipeline IRCAM (SuperVP/AudioSculpt)</w:t>
             </w:r>
           </w:p>
         </w:tc>
@@ -929,7 +929,7 @@
                 <w:b/>
                 <w:sz w:val="18"/>
               </w:rPr>
-              <w:t>Hauteur minimale</w:t>
+              <w:t>Algorithme</w:t>
             </w:r>
           </w:p>
         </w:tc>
@@ -947,7 +947,45 @@
                 <w:b w:val="0"/>
                 <w:sz w:val="18"/>
               </w:rPr>
-              <w:t>10 % de l'amplitude maximale</w:t>
+              <w:t>Détection de pics sur enveloppe spectrale — pic le plus proéminent (pas premier pic)</w:t>
+            </w:r>
+          </w:p>
+        </w:tc>
+      </w:tr>
+      <w:tr>
+        <w:tc>
+          <w:tcPr>
+            <w:tcW w:type="dxa" w:w="2835"/>
+          </w:tcPr>
+          <w:p>
+            <w:pPr>
+              <w:jc w:val="center"/>
+            </w:pPr>
+            <w:r/>
+            <w:r>
+              <w:rPr>
+                <w:b/>
+                <w:sz w:val="18"/>
+              </w:rPr>
+              <w:t>Seuil d'amplitude</w:t>
+            </w:r>
+          </w:p>
+        </w:tc>
+        <w:tc>
+          <w:tcPr>
+            <w:tcW w:type="dxa" w:w="6520"/>
+          </w:tcPr>
+          <w:p>
+            <w:pPr>
+              <w:jc w:val="left"/>
+            </w:pPr>
+            <w:r/>
+            <w:r>
+              <w:rPr>
+                <w:b w:val="0"/>
+                <w:sz w:val="18"/>
+              </w:rPr>
+              <w:t>−30 dB sous le pic maximum de la région</w:t>
             </w:r>
           </w:p>
         </w:tc>
@@ -985,45 +1023,7 @@
                 <w:b w:val="0"/>
                 <w:sz w:val="18"/>
               </w:rPr>
-              <w:t>10 bins (~50 Hz)</w:t>
-            </w:r>
-          </w:p>
-        </w:tc>
-      </w:tr>
-      <w:tr>
-        <w:tc>
-          <w:tcPr>
-            <w:tcW w:type="dxa" w:w="2835"/>
-          </w:tcPr>
-          <w:p>
-            <w:pPr>
-              <w:jc w:val="center"/>
-            </w:pPr>
-            <w:r/>
-            <w:r>
-              <w:rPr>
-                <w:b/>
-                <w:sz w:val="18"/>
-              </w:rPr>
-              <w:t>Proéminence minimale</w:t>
-            </w:r>
-          </w:p>
-        </w:tc>
-        <w:tc>
-          <w:tcPr>
-            <w:tcW w:type="dxa" w:w="6520"/>
-          </w:tcPr>
-          <w:p>
-            <w:pPr>
-              <w:jc w:val="left"/>
-            </w:pPr>
-            <w:r/>
-            <w:r>
-              <w:rPr>
-                <w:b w:val="0"/>
-                <w:sz w:val="18"/>
-              </w:rPr>
-              <w:t>5 % de l'amplitude maximale</w:t>
+              <w:t>70 Hz entre pics (~6.5 bins)</w:t>
             </w:r>
           </w:p>
         </w:tc>

</xml_diff>